<commit_message>
Finalizar entrega del Grupo 5
</commit_message>
<xml_diff>
--- a/entrega/Informe_PA2_Listas_Enlazadas.docx
+++ b/entrega/Informe_PA2_Listas_Enlazadas.docx
@@ -249,7 +249,7 @@
                 <w:rFonts w:ascii="Arial" w:hAnsi="Arial"/>
                 <w:sz w:val="17"/>
               </w:rPr>
-              <w:t>[POR COMPLETAR]</w:t>
+              <w:t>Wildr Julio Espinoza Bravo</w:t>
             </w:r>
           </w:p>
         </w:tc>
@@ -269,7 +269,7 @@
                 <w:rFonts w:ascii="Arial" w:hAnsi="Arial"/>
                 <w:sz w:val="17"/>
               </w:rPr>
-              <w:t>Sección</w:t>
+              <w:t>NRC</w:t>
             </w:r>
           </w:p>
         </w:tc>
@@ -287,7 +287,7 @@
                 <w:rFonts w:ascii="Arial" w:hAnsi="Arial"/>
                 <w:sz w:val="17"/>
               </w:rPr>
-              <w:t>[POR COMPLETAR]</w:t>
+              <w:t>4134</w:t>
             </w:r>
           </w:p>
         </w:tc>
@@ -325,9 +325,13 @@
                 <w:rFonts w:ascii="Arial" w:hAnsi="Arial"/>
                 <w:sz w:val="17"/>
               </w:rPr>
-              <w:t>1. [NOMBRE]    2. [NOMBRE]    3. [NOMBRE]</w:t>
+              <w:t>1. Leonardo Cuadros</w:t>
               <w:br/>
-              <w:t>4. [NOMBRE]    5. [NOMBRE]</w:t>
+              <w:t>2. Jhonatan Lino</w:t>
+              <w:br/>
+              <w:t>3. Anthony Fernando</w:t>
+              <w:br/>
+              <w:t>4. Victor Sinche</w:t>
             </w:r>
           </w:p>
         </w:tc>
@@ -365,7 +369,7 @@
                 <w:rFonts w:ascii="Arial" w:hAnsi="Arial"/>
                 <w:sz w:val="17"/>
               </w:rPr>
-              <w:t>14 de octubre de 2026</w:t>
+              <w:t>15 de octubre de 2026</w:t>
             </w:r>
           </w:p>
         </w:tc>
@@ -3184,7 +3188,7 @@
         <w:spacing w:after="60"/>
       </w:pPr>
       <w:r>
-        <w:t>Repositorio GitHub: carpeta preparada con código, diagramas, pseudocódigo, pruebas y README; el enlace real se añadirá después de publicarla.</w:t>
+        <w:t>Repositorio GitHub: proyecto publicado con código, diagramas, pseudocódigo, pruebas y README. Enlace: https://github.com/totomanxd321/PA2_Listas_Enlazadas_Grupo5</w:t>
       </w:r>
     </w:p>
     <w:p>
@@ -3193,7 +3197,7 @@
         <w:spacing w:after="60"/>
       </w:pPr>
       <w:r>
-        <w:t>Video: guion distribuido para cinco participantes. Deben grabarlo con cámaras encendidas, subirlo a YouTube y pegar la URL verdadera en el README.</w:t>
+        <w:t>Video: guion distribuido entre cuatro participantes. El equipo grabará la exposición con las cámaras encendidas y añadirá el enlace de YouTube al README antes de entregar.</w:t>
       </w:r>
     </w:p>
     <w:p>
@@ -3202,12 +3206,12 @@
         <w:spacing w:after="60"/>
       </w:pPr>
       <w:r>
-        <w:t>Asistencia y seguimiento: criterio exclusivo del registro y la valoración del docente. No se fabrica ni se sustituye con una declaración del informe.</w:t>
+        <w:t>Asistencia y seguimiento: se acreditan mediante el registro y la valoración del docente.</w:t>
       </w:r>
     </w:p>
     <w:p>
       <w:r>
-        <w:t>Repositorio: [ENLACE REAL PENDIENTE].    Video de YouTube: [ENLACE REAL PENDIENTE].</w:t>
+        <w:t>Repositorio: https://github.com/totomanxd321/PA2_Listas_Enlazadas_Grupo5    Video de YouTube: pendiente de publicación.</w:t>
       </w:r>
     </w:p>
     <w:p>
@@ -3220,7 +3224,7 @@
     </w:p>
     <w:p>
       <w:r>
-        <w:t>Enunciado y rúbrica entregados por el docente: «PA2 - Evaluación aplicada sobre listas enlazadas», curso 30710, sesiones 5 a 7 (3 páginas). Los algoritmos, diagramas y ejemplos de este informe son una elaboración del equipo propuesta para resolver el caso.</w:t>
+        <w:t>Enunciado y rúbrica entregados por el docente: «PA2 - Evaluación aplicada sobre listas enlazadas», curso 30710, NRC 4134, sesiones 5 a 7 (3 páginas). Los algoritmos, diagramas y ejemplos de este informe son una elaboración del equipo propuesta para resolver el caso.</w:t>
       </w:r>
     </w:p>
     <w:sectPr>

</xml_diff>

<commit_message>
Añadir enlace del repositorio al informe
</commit_message>
<xml_diff>
--- a/entrega/Informe_PA2_Listas_Enlazadas.docx
+++ b/entrega/Informe_PA2_Listas_Enlazadas.docx
@@ -3188,8 +3188,17 @@
         <w:spacing w:after="60"/>
       </w:pPr>
       <w:r>
-        <w:t>Repositorio GitHub: proyecto publicado con código, diagramas, pseudocódigo, pruebas y README. Enlace: https://github.com/totomanxd321/PA2_Listas_Enlazadas_Grupo5</w:t>
+        <w:t xml:space="preserve">Repositorio GitHub: proyecto publicado con código, diagramas, pseudocódigo, pruebas y README. Enlace: </w:t>
       </w:r>
+      <w:hyperlink r:id="rId17" w:history="1">
+        <w:r>
+          <w:rPr>
+            <w:color w:val="0563C1"/>
+            <w:u w:val="single"/>
+          </w:rPr>
+          <w:t>https://github.com/totomanxd321/PA2_Listas_Enlazadas_Grupo5</w:t>
+        </w:r>
+      </w:hyperlink>
     </w:p>
     <w:p>
       <w:pPr>
@@ -3211,7 +3220,19 @@
     </w:p>
     <w:p>
       <w:r>
-        <w:t>Repositorio: https://github.com/totomanxd321/PA2_Listas_Enlazadas_Grupo5    Video de YouTube: pendiente de publicación.</w:t>
+        <w:t xml:space="preserve">Repositorio: </w:t>
+      </w:r>
+      <w:hyperlink r:id="rId17" w:history="1">
+        <w:r>
+          <w:rPr>
+            <w:color w:val="0563C1"/>
+            <w:u w:val="single"/>
+          </w:rPr>
+          <w:t>https://github.com/totomanxd321/PA2_Listas_Enlazadas_Grupo5</w:t>
+        </w:r>
+      </w:hyperlink>
+      <w:r>
+        <w:t xml:space="preserve">    Video de YouTube: pendiente de publicación.</w:t>
       </w:r>
     </w:p>
     <w:p>

</xml_diff>